<commit_message>
Revisión final: comentarios propios, encoding ASCII, correcciones informe
- Comentarios del script simplificados (estilo propio del estudiante)
- Eliminados imports sin usar (sys, mpatches)
- Caracteres Unicode en print() reemplazados por ASCII (compatibilidad cp1252)
- Informe Word: "mapa de dispersión" → "mapa de calor"
- Informe Word: eliminadas referencias al enunciado de la tarea
- Informe Word: corregidos separadores de miles (1.499 → 1499)
- CLAUDE.md actualizado con estado completo del proyecto

Co-Authored-By: Claude Opus 4.6 (1M context) <noreply@anthropic.com>
</commit_message>
<xml_diff>
--- a/Tarea1_DisenoSismorresistente_PabloBaez.docx
+++ b/Tarea1_DisenoSismorresistente_PabloBaez.docx
@@ -245,7 +245,7 @@
           <w:rFonts w:ascii="Times New Roman" w:hAnsi="Times New Roman"/>
           <w:sz w:val="24"/>
         </w:rPr>
-        <w:t>El presente informe desarrolla el análisis del catálogo sísmico homogeneizado del Ecuador, elaborado por el Instituto Geofísico de la Escuela Politécnica Nacional (IGEPN) y documentado en la publicación de Beauval et al. (2013). El catálogo abarca el período comprendido entre 1901 y 2009, conteniendo 10.742 eventos sísmicos con magnitud Mw igual o superior a 3.0, cuyas magnitudes fueron homogeneizadas a la escala de magnitud momento (Mw). A partir de estos datos se realizan análisis espaciales, estadísticos y de frecuencia que permiten caracterizar el comportamiento de la sismicidad en el territorio ecuatoriano y su relación con el alto peligro sísmico que enfrenta el país, debido principalmente a la subducción de la Placa de Nazca bajo la Placa Sudamericana y la presencia de fallas activas en la región interandina.</w:t>
+        <w:t>El presente informe desarrolla el análisis del catálogo sísmico homogeneizado del Ecuador, elaborado por el Instituto Geofísico de la Escuela Politécnica Nacional (IGEPN) y documentado en la publicación de Beauval et al. (2013). El catálogo abarca el período comprendido entre 1901 y 2009, conteniendo 10 742 eventos sísmicos con magnitud Mw igual o superior a 3.0, cuyas magnitudes fueron homogeneizadas a la escala de magnitud momento (Mw). A partir de estos datos se realizan análisis espaciales, estadísticos y de frecuencia que permiten caracterizar el comportamiento de la sismicidad en el territorio ecuatoriano y su relación con el alto peligro sísmico que enfrenta el país, debido principalmente a la subducción de la Placa de Nazca bajo la Placa Sudamericana y la presencia de fallas activas en la región interandina.</w:t>
       </w:r>
     </w:p>
     <w:p>
@@ -273,7 +273,7 @@
           <w:rFonts w:ascii="Times New Roman" w:hAnsi="Times New Roman"/>
           <w:sz w:val="24"/>
         </w:rPr>
-        <w:t>Para el análisis espacial se elaboró un mapa de dispersión de los eventos sísmicos registrados en el catálogo, utilizando la magnitud Mw como variable de referencia. Se diferenciaron tres rangos de magnitud: eventos con Mw mayor a 7 (representados en rojo con marcadores grandes), eventos con Mw entre 5 y 7 (en naranja con marcadores medianos) y eventos con Mw entre 4 y 5 (en amarillo con marcadores pequeños). Los eventos con magnitud inferior a 3 fueron excluidos del análisis, tal como lo establece el enunciado de la tarea.</w:t>
+        <w:t>Para el análisis espacial se elaboró un mapa de calor de los eventos sísmicos registrados en el catálogo, utilizando la magnitud Mw como variable de referencia. Se diferenciaron tres rangos de magnitud: eventos con Mw mayor a 7 (representados en rojo con marcadores grandes), eventos con Mw entre 5 y 7 (en naranja con marcadores medianos) y eventos con Mw entre 4 y 5 (en amarillo con marcadores pequeños). Los eventos con magnitud inferior a 3 fueron excluidos del análisis.</w:t>
       </w:r>
     </w:p>
     <w:p>
@@ -283,7 +283,7 @@
       <w:r>
         <w:drawing>
           <wp:inline xmlns:a="http://schemas.openxmlformats.org/drawingml/2006/main" xmlns:pic="http://schemas.openxmlformats.org/drawingml/2006/picture">
-            <wp:extent cx="5400000" cy="5588942"/>
+            <wp:extent cx="5400000" cy="4050000"/>
             <wp:docPr id="1" name="Picture 1"/>
             <wp:cNvGraphicFramePr>
               <a:graphicFrameLocks noChangeAspect="1"/>
@@ -304,7 +304,7 @@
                   <pic:spPr>
                     <a:xfrm>
                       <a:off x="0" y="0"/>
-                      <a:ext cx="5400000" cy="5588942"/>
+                      <a:ext cx="5400000" cy="4050000"/>
                     </a:xfrm>
                     <a:prstGeom prst="rect"/>
                   </pic:spPr>
@@ -340,7 +340,7 @@
           <w:rFonts w:ascii="Times New Roman" w:hAnsi="Times New Roman"/>
           <w:sz w:val="24"/>
         </w:rPr>
-        <w:t>El mapa muestra una concentración notable de eventos sísmicos a lo largo de la zona costera, particularmente en la región norte (Esmeraldas y Manabí), lo cual se asocia directamente con la zona de subducción de la Placa de Nazca. Los eventos de mayor magnitud (Mw &gt; 7) se distribuyen principalmente en esta franja costera, confirmando que la interfaz de subducción constituye la fuente sismogénica más peligrosa del país. En la región interandina (Sierra) se observa una sismicidad moderada pero persistente, asociada al sistema de fallas activas que atraviesa el callejón interandino. En total se registraron 2.581 eventos con Mw entre 4 y 5, 534 eventos con Mw entre 5 y 7, y 22 eventos con Mw superior a 7.</w:t>
+        <w:t>El mapa muestra una concentración notable de eventos sísmicos a lo largo de la zona costera, particularmente en la región norte (Esmeraldas y Manabí), lo cual se asocia directamente con la zona de subducción de la Placa de Nazca. Los eventos de mayor magnitud (Mw &gt; 7) se distribuyen principalmente en esta franja costera, confirmando que la interfaz de subducción constituye la fuente sismogénica más peligrosa del país. En la región interandina (Sierra) se observa una sismicidad moderada pero persistente, asociada al sistema de fallas activas que atraviesa el callejón interandino. En total se registraron 2581 eventos con Mw entre 4 y 5, 534 eventos con Mw entre 5 y 7, y 22 eventos con Mw superior a 7.</w:t>
       </w:r>
     </w:p>
     <w:p>
@@ -354,7 +354,7 @@
           <w:rFonts w:ascii="Times New Roman" w:hAnsi="Times New Roman"/>
           <w:sz w:val="24"/>
         </w:rPr>
-        <w:t>Adicionalmente se generó un mapa de calor interactivo mediante la librería Folium, el cual permite una exploración dinámica de la distribución espacial de los eventos sísmicos. Este mapa se entrega como archivo HTML adjunto.</w:t>
+        <w:t>Adicionalmente se generó un mapa de calor interactivo mediante la librería Folium, el cual permite una exploración dinámica de la distribución espacial de los eventos sísmicos. Este mapa se genera automáticamente al ejecutar el script de Python.</w:t>
       </w:r>
     </w:p>
     <w:p>
@@ -1862,7 +1862,7 @@
           <w:rFonts w:ascii="Times New Roman" w:hAnsi="Times New Roman"/>
           <w:sz w:val="24"/>
         </w:rPr>
-        <w:t>Se elaboró un histograma de frecuencias para los eventos sísmicos con Mw igual o superior a 4.0, clasificados en siete intervalos de magnitud definidos por el enunciado de la tarea: 4.0-4.5, 4.5-5.0, 5.0-5.5, 5.5-6.0, 6.0-6.5, 6.5-7.0 y mayores a 7.0.</w:t>
+        <w:t>Se elaboró un histograma de frecuencias para los eventos sísmicos con Mw igual o superior a 4.0, clasificados en siete intervalos de magnitud: 4.0-4.5, 4.5-5.0, 5.0-5.5, 5.5-6.0, 6.0-6.5, 6.5-7.0 y mayores a 7.0.</w:t>
       </w:r>
     </w:p>
     <w:p>
@@ -1872,7 +1872,7 @@
       <w:r>
         <w:drawing>
           <wp:inline xmlns:a="http://schemas.openxmlformats.org/drawingml/2006/main" xmlns:pic="http://schemas.openxmlformats.org/drawingml/2006/picture">
-            <wp:extent cx="5040000" cy="3481200"/>
+            <wp:extent cx="5040000" cy="3207273"/>
             <wp:docPr id="2" name="Picture 2"/>
             <wp:cNvGraphicFramePr>
               <a:graphicFrameLocks noChangeAspect="1"/>
@@ -1893,7 +1893,7 @@
                   <pic:spPr>
                     <a:xfrm>
                       <a:off x="0" y="0"/>
-                      <a:ext cx="5040000" cy="3481200"/>
+                      <a:ext cx="5040000" cy="3207273"/>
                     </a:xfrm>
                     <a:prstGeom prst="rect"/>
                   </pic:spPr>
@@ -1929,7 +1929,7 @@
           <w:rFonts w:ascii="Times New Roman" w:hAnsi="Times New Roman"/>
           <w:sz w:val="24"/>
         </w:rPr>
-        <w:t>El histograma muestra una distribución inversamente proporcional entre la magnitud y la frecuencia de eventos, lo cual es consistente con la ley de Gutenberg-Richter (log N = a - bM). El intervalo de 4.0 a 4.5 concentra la mayor cantidad de eventos con 1.499 registros, lo que representa el 47.7% del total de sismos con Mw igual o superior a 4.0. A medida que aumenta la magnitud, la frecuencia disminuye de forma exponencial: 1.082 eventos en el rango 4.5-5.0, 325 en el rango 5.0-5.5, 103 en el rango 5.5-6.0, 60 en el rango 6.0-6.5, 46 en el rango 6.5-7.0, y apenas 22 eventos con magnitud superior a 7.0. Esta distribución refleja el comportamiento típico de una zona de alta sismicidad asociada a un margen de subducción activo, donde los eventos de gran magnitud son poco frecuentes pero representan el mayor peligro para las estructuras y la población.</w:t>
+        <w:t>El histograma muestra una distribución inversamente proporcional entre la magnitud y la frecuencia de eventos, lo cual es consistente con la ley de Gutenberg-Richter (log N = a - bM). El intervalo de 4.0 a 4.5 concentra la mayor cantidad de eventos con 1499 registros, lo que representa el 47.7% del total de sismos con Mw igual o superior a 4.0. A medida que aumenta la magnitud, la frecuencia disminuye de forma exponencial: 1082 eventos en el rango 4.5-5.0, 325 en el rango 5.0-5.5, 103 en el rango 5.5-6.0, 60 en el rango 6.0-6.5, 46 en el rango 6.5-7.0, y apenas 22 eventos con magnitud superior a 7.0. Esta distribución refleja el comportamiento típico de una zona de alta sismicidad asociada a un margen de subducción activo, donde los eventos de gran magnitud son poco frecuentes pero representan el mayor peligro para las estructuras y la población.</w:t>
       </w:r>
     </w:p>
     <w:p>
@@ -1957,7 +1957,7 @@
           <w:rFonts w:ascii="Times New Roman" w:hAnsi="Times New Roman"/>
           <w:sz w:val="24"/>
         </w:rPr>
-        <w:t>Se calcularon las estadísticas descriptivas de las magnitudes de los 10.742 eventos sísmicos del catálogo. La magnitud promedio es de 3.69 Mw, la mediana es de 3.40 Mw y la desviación estándar es de 0.70. Se ajustó una distribución normal a los datos de magnitud mediante el método de máxima verosimilitud, obteniéndose los cuantiles P16 = 2.99 y P84 = 4.38, los cuales se representan mediante líneas verticales en la gráfica junto con el promedio y la mediana.</w:t>
+        <w:t>Se calcularon las estadísticas descriptivas de las magnitudes de los 10 742 eventos sísmicos del catálogo. La magnitud promedio es de 3.69 Mw, la mediana es de 3.40 Mw y la desviación estándar es de 0.70. Se ajustó una distribución normal a los datos de magnitud mediante el método de máxima verosimilitud, obteniéndose los cuantiles P16 = 2.99 y P84 = 4.38, los cuales se representan mediante líneas verticales en la gráfica junto con el promedio y la mediana.</w:t>
       </w:r>
     </w:p>
     <w:p>
@@ -1967,7 +1967,7 @@
       <w:r>
         <w:drawing>
           <wp:inline xmlns:a="http://schemas.openxmlformats.org/drawingml/2006/main" xmlns:pic="http://schemas.openxmlformats.org/drawingml/2006/picture">
-            <wp:extent cx="5040000" cy="3494930"/>
+            <wp:extent cx="5040000" cy="3207273"/>
             <wp:docPr id="3" name="Picture 3"/>
             <wp:cNvGraphicFramePr>
               <a:graphicFrameLocks noChangeAspect="1"/>
@@ -1988,7 +1988,7 @@
                   <pic:spPr>
                     <a:xfrm>
                       <a:off x="0" y="0"/>
-                      <a:ext cx="5040000" cy="3494930"/>
+                      <a:ext cx="5040000" cy="3207273"/>
                     </a:xfrm>
                     <a:prstGeom prst="rect"/>
                   </pic:spPr>
@@ -2062,7 +2062,7 @@
       <w:r>
         <w:drawing>
           <wp:inline xmlns:a="http://schemas.openxmlformats.org/drawingml/2006/main" xmlns:pic="http://schemas.openxmlformats.org/drawingml/2006/picture">
-            <wp:extent cx="5040000" cy="3466344"/>
+            <wp:extent cx="5040000" cy="3207273"/>
             <wp:docPr id="4" name="Picture 4"/>
             <wp:cNvGraphicFramePr>
               <a:graphicFrameLocks noChangeAspect="1"/>
@@ -2083,7 +2083,7 @@
                   <pic:spPr>
                     <a:xfrm>
                       <a:off x="0" y="0"/>
-                      <a:ext cx="5040000" cy="3466344"/>
+                      <a:ext cx="5040000" cy="3207273"/>
                     </a:xfrm>
                     <a:prstGeom prst="rect"/>
                   </pic:spPr>
@@ -2161,7 +2161,7 @@
           <w:rFonts w:ascii="Times New Roman" w:hAnsi="Times New Roman"/>
           <w:sz w:val="24"/>
         </w:rPr>
-        <w:t>El Ecuador presenta una sismicidad elevada y sostenida, con 10.742 eventos sísmicos registrados con Mw igual o superior a 3.0 en un período de 109 años, incluyendo 22 eventos de magnitud Mw igual o superior a 7.0. Esta actividad sísmica se asocia directamente con la subducción de la Placa de Nazca bajo la Placa Sudamericana, proceso tectónico que genera los sismos de mayor magnitud en la zona costera del país, y con la presencia de fallas activas en la región interandina.</w:t>
+        <w:t>El Ecuador presenta una sismicidad elevada y sostenida, con 10 742 eventos sísmicos registrados con Mw igual o superior a 3.0 en un período de 109 años, incluyendo 22 eventos de magnitud Mw igual o superior a 7.0. Esta actividad sísmica se asocia directamente con la subducción de la Placa de Nazca bajo la Placa Sudamericana, proceso tectónico que genera los sismos de mayor magnitud en la zona costera del país, y con la presencia de fallas activas en la región interandina.</w:t>
       </w:r>
     </w:p>
     <w:p>

</xml_diff>